<commit_message>
Add HR Administrative Officer role, fix Baazar start month
Adds the HR Administrative Officer casual role at Monash University
(Aug-Oct 2026, HR Projects team) to the Experience log and both resume
files, using only the facts confirmed on the signed offer letter since
no specific duties were listed beyond "as directed". Also corrects the
Baazar internship start date in the resume files to September 2026
(it read August, out of sync with the site).

Co-Authored-By: Claude Sonnet 5 <noreply@anthropic.com>
Claude-Session: https://claude.ai/code/session_018fL7XbNAnV8MdDoG4hnUEg
</commit_message>
<xml_diff>
--- a/Madhumitha_Challa_Intern_Graduate.docx
+++ b/Madhumitha_Challa_Intern_Graduate.docx
@@ -111,6 +111,30 @@
         <w:spacing w:after="100" w:before="100"/>
       </w:pPr>
       <w:r>
+        <w:t>HR Administrative Officer | Monash University</w:t>
+      </w:r>
+    </w:p>
+    <w:p>
+      <w:pPr>
+        <w:spacing w:after="100"/>
+      </w:pPr>
+      <w:r>
+        <w:t>August 2026–October 2026</w:t>
+      </w:r>
+    </w:p>
+    <w:p>
+      <w:pPr>
+        <w:spacing w:after="50"/>
+      </w:pPr>
+      <w:r>
+        <w:t>• Casual HR Administrative Officer role (HEW 4, ~10 hrs/week) within the HR Projects team, Office of the Chief Operating Officer &amp; Senior Vice-President, Clayton Campus</w:t>
+      </w:r>
+    </w:p>
+    <w:p>
+      <w:pPr>
+        <w:spacing w:after="100" w:before="100"/>
+      </w:pPr>
+      <w:r>
         <w:t xml:space="preserve">Technology &amp; Digital Innovation Intern | Baazar (Fund'ex venture)</w:t>
       </w:r>
     </w:p>
@@ -119,7 +143,7 @@
         <w:spacing w:after="100"/>
       </w:pPr>
       <w:r>
-        <w:t xml:space="preserve">August 2026–Present</w:t>
+        <w:t>September 2026–Present</w:t>
       </w:r>
     </w:p>
     <w:p>

</xml_diff>

<commit_message>
Color-code the nav, add hero intro line, fill in Baazar and Student Adviser experience, fix blank coffee email link
- Nav links get per-section accent colors; hover uses brightness instead of a hardcoded color
- Add a short intro line under the hero portrait
- About: note Dec 2026 graduation, 485 visa transition, and openness to relocating across Australia
- Fill in the Baazar internship description (was a placeholder) on the site and both resume downloads
- Add the missing Student Adviser (Monash Student Communities) role to both resume downloads
- Fix the "Prefer email?" coffee link sending a blank-body email; now pre-fills a proper message and points to the Calendly tab
</commit_message>
<xml_diff>
--- a/Madhumitha_Challa_Intern_Graduate.docx
+++ b/Madhumitha_Challa_Intern_Graduate.docx
@@ -151,15 +151,23 @@
         <w:spacing w:after="50"/>
       </w:pPr>
       <w:r>
-        <w:t xml:space="preserve">• Selected to work on emerging technology integration for fintech platform; exposure to cloud infrastructure scaling and real-time transaction monitoring systems</w:t>
-      </w:r>
-    </w:p>
-    <w:p>
-      <w:pPr>
-        <w:spacing w:after="200"/>
-      </w:pPr>
-      <w:r>
-        <w:t xml:space="preserve">• Contributing to architecture decisions and digital innovation pipeline for growing fintech venture</w:t>
+        <w:t xml:space="preserve">• Supporting digital platform research, planning, and technical documentation for an upcoming venture; contributing to website/software testing, user testing, and bug reporting under supervision</w:t>
+      </w:r>
+    </w:p>
+    <w:p>
+      <w:pPr>
+        <w:spacing w:after="50"/>
+      </w:pPr>
+      <w:r>
+        <w:t xml:space="preserve">• Supporting data organisation, reporting, and dashboard/analytics tasks alongside CRM and business process documentation; researching software tools, APIs, and digital platform solutions</w:t>
+      </w:r>
+    </w:p>
+    <w:p>
+      <w:pPr>
+        <w:spacing w:after="200"/>
+      </w:pPr>
+      <w:r>
+        <w:t xml:space="preserve">• Preparing user guides, workflow notes, and process maps; applying cybersecurity awareness practices, including documentation and basic risk checks, as part of structured team learning tasks</w:t>
       </w:r>
     </w:p>
     <w:p>
@@ -396,10 +404,26 @@
     </w:p>
     <w:p>
       <w:pPr>
+        <w:spacing w:after="200"/>
+      </w:pPr>
+      <w:r>
+        <w:t xml:space="preserve">• Mentor 20+ postgraduate IT students; manage infrastructure for Monash Data &amp; AI Society (1,600+ members); support community growth and peer learning</w:t>
+      </w:r>
+    </w:p>
+    <w:p>
+      <w:pPr>
+        <w:spacing w:after="100" w:before="100"/>
+      </w:pPr>
+      <w:r>
+        <w:t xml:space="preserve">Student Adviser | Monash Student Communities | Jul 2024–Present</w:t>
+      </w:r>
+    </w:p>
+    <w:p>
+      <w:pPr>
         <w:spacing w:after="400"/>
       </w:pPr>
       <w:r>
-        <w:t xml:space="preserve">• Mentor 20+ postgraduate IT students; manage infrastructure for Monash Data &amp; AI Society (1,600+ members); support community growth and peer learning</w:t>
+        <w:t xml:space="preserve">• Mentor a cohort of undergrad and postgrad students through one-on-one check-ins and cluster catch-ups, helping new students navigate university life, and encouraging several of my own mentees to step up into advising themselves</w:t>
       </w:r>
     </w:p>
     <w:p>

</xml_diff>

<commit_message>
Color-code the nav, add hero intro line, fill in Baazar and Student Adviser experience, fix blank coffee email link (#7)
- Nav links get per-section accent colors; hover uses brightness instead of a hardcoded color
- Add a short intro line under the hero portrait
- About: note Dec 2026 graduation, 485 visa transition, and openness to relocating across Australia
- Fill in the Baazar internship description (was a placeholder) on the site and both resume downloads
- Add the missing Student Adviser (Monash Student Communities) role to both resume downloads
- Fix the "Prefer email?" coffee link sending a blank-body email; now pre-fills a proper message and points to the Calendly tab
</commit_message>
<xml_diff>
--- a/Madhumitha_Challa_Intern_Graduate.docx
+++ b/Madhumitha_Challa_Intern_Graduate.docx
@@ -151,15 +151,23 @@
         <w:spacing w:after="50"/>
       </w:pPr>
       <w:r>
-        <w:t xml:space="preserve">• Selected to work on emerging technology integration for fintech platform; exposure to cloud infrastructure scaling and real-time transaction monitoring systems</w:t>
-      </w:r>
-    </w:p>
-    <w:p>
-      <w:pPr>
-        <w:spacing w:after="200"/>
-      </w:pPr>
-      <w:r>
-        <w:t xml:space="preserve">• Contributing to architecture decisions and digital innovation pipeline for growing fintech venture</w:t>
+        <w:t xml:space="preserve">• Supporting digital platform research, planning, and technical documentation for an upcoming venture; contributing to website/software testing, user testing, and bug reporting under supervision</w:t>
+      </w:r>
+    </w:p>
+    <w:p>
+      <w:pPr>
+        <w:spacing w:after="50"/>
+      </w:pPr>
+      <w:r>
+        <w:t xml:space="preserve">• Supporting data organisation, reporting, and dashboard/analytics tasks alongside CRM and business process documentation; researching software tools, APIs, and digital platform solutions</w:t>
+      </w:r>
+    </w:p>
+    <w:p>
+      <w:pPr>
+        <w:spacing w:after="200"/>
+      </w:pPr>
+      <w:r>
+        <w:t xml:space="preserve">• Preparing user guides, workflow notes, and process maps; applying cybersecurity awareness practices, including documentation and basic risk checks, as part of structured team learning tasks</w:t>
       </w:r>
     </w:p>
     <w:p>
@@ -396,10 +404,26 @@
     </w:p>
     <w:p>
       <w:pPr>
+        <w:spacing w:after="200"/>
+      </w:pPr>
+      <w:r>
+        <w:t xml:space="preserve">• Mentor 20+ postgraduate IT students; manage infrastructure for Monash Data &amp; AI Society (1,600+ members); support community growth and peer learning</w:t>
+      </w:r>
+    </w:p>
+    <w:p>
+      <w:pPr>
+        <w:spacing w:after="100" w:before="100"/>
+      </w:pPr>
+      <w:r>
+        <w:t xml:space="preserve">Student Adviser | Monash Student Communities | Jul 2024–Present</w:t>
+      </w:r>
+    </w:p>
+    <w:p>
+      <w:pPr>
         <w:spacing w:after="400"/>
       </w:pPr>
       <w:r>
-        <w:t xml:space="preserve">• Mentor 20+ postgraduate IT students; manage infrastructure for Monash Data &amp; AI Society (1,600+ members); support community growth and peer learning</w:t>
+        <w:t xml:space="preserve">• Mentor a cohort of undergrad and postgrad students through one-on-one check-ins and cluster catch-ups, helping new students navigate university life, and encouraging several of my own mentees to step up into advising themselves</w:t>
       </w:r>
     </w:p>
     <w:p>

</xml_diff>

<commit_message>
Remove Oracle Cloud migration claim, fully detail the Avaya-to-Genesys migration
- Drop all "Oracle Cloud HCM migration" content (Programmer Analyst tile,
  resume Core Competencies, role subtitle, and the $700K/17-modules/30%
  cost-reduction bullet) from the portfolio, the downloadable PDF resume,
  and the DOCX resume.
- Properly detail the Avaya-to-Genesys Cloud CX migration on the resume
  (it was already complete on the portfolio): name Avaya explicitly, and
  add the 8-lines-of-business and 2% average-handling-time figures that
  were on the portfolio but missing from the resume.
- Resume PDF was rebuilt directly from its own extracted layout (same
  fonts/margins/colors) so it stays a clean 2-page document; resume DOCX
  edited and validated directly.

Co-Authored-By: Claude Sonnet 5 <noreply@anthropic.com>
Claude-Session: https://claude.ai/code/session_01DzH1d4xTk3fh1jGc7zmtxu
</commit_message>
<xml_diff>
--- a/Madhumitha_Challa_Intern_Graduate.docx
+++ b/Madhumitha_Challa_Intern_Graduate.docx
@@ -47,7 +47,7 @@
         <w:spacing w:after="400"/>
       </w:pPr>
       <w:r>
-        <w:t xml:space="preserve">Enterprise IT professional with 3+ years of hands-on experience at Cognizant Technology Solutions delivering quantifiable digital transformation across mission-critical healthcare operations (3.2M members). Currently finalizing Master of Information Technology at Monash University (graduating Dec 2026, WAM 65.7). Proven track record: USD 700K annual cost savings, 30% IT cost reduction, 5% patient engagement improvement, 95%+ audit compliance maintained. Expertise in real-time systems monitoring, cloud platform modernization, root cause analysis, and infrastructure optimization. AWS CCP certified. Demonstrated leadership mentoring 20+ postgraduate IT students.</w:t>
+        <w:t xml:space="preserve">Enterprise IT professional with 3+ years of hands-on experience at Cognizant Technology Solutions delivering quantifiable digital transformation across mission-critical healthcare operations (3.2M members). Currently finalizing Master of Information Technology at Monash University (graduating Dec 2026, WAM 65.7). Proven track record: Avaya-to-Genesys Cloud CX migration across 30,000+ associates and agents, 5% patient engagement improvement, 20% reduction in manual interventions, 95%+ audit compliance maintained. Expertise in real-time systems monitoring, cloud platform modernization, root cause analysis, and infrastructure optimization. AWS CCP certified. Demonstrated leadership mentoring 20+ postgraduate IT students.</w:t>
       </w:r>
     </w:p>
     <w:p>
@@ -67,7 +67,7 @@
         <w:spacing w:after="100"/>
       </w:pPr>
       <w:r>
-        <w:t xml:space="preserve">Cloud Platforms &amp; Modernization: Oracle Cloud HCM | Genesys Cloud CX | Google Cloud | AWS | Azure MFA | Microsoft 365</w:t>
+        <w:t xml:space="preserve">Cloud Platforms &amp; Modernization: Genesys Cloud CX | Google Cloud | AWS | Azure MFA | Microsoft 365</w:t>
       </w:r>
     </w:p>
     <w:p>
@@ -291,7 +291,7 @@
         <w:spacing w:after="50"/>
       </w:pPr>
       <w:r>
-        <w:t xml:space="preserve">• Contributed to Genesys Cloud CX migration (30,000+ associates): delivered 5% patient engagement improvement and 20% reduction in manual interventions — quantifiable proof of impact in cloud-driven digital transformation</w:t>
+        <w:t xml:space="preserve">• Contributed to Cognizant’s Avaya-to-Genesys Cloud CX contact center migration (30,000+ associates and agents across 8 lines of business): delivered a 5% increase in patient engagement, 20% reduction in manual interventions per week, and 2% decrease in average handling time — quantifiable proof of impact in cloud-driven digital transformation</w:t>
       </w:r>
     </w:p>
     <w:p>
@@ -315,15 +315,7 @@
         <w:spacing w:after="50"/>
       </w:pPr>
       <w:r>
-        <w:t xml:space="preserve">Cloud Modernization &amp; Enterprise Systems Integration (Oracle Cloud HCM):</w:t>
-      </w:r>
-    </w:p>
-    <w:p>
-      <w:pPr>
-        <w:spacing w:after="50"/>
-      </w:pPr>
-      <w:r>
-        <w:t xml:space="preserve">• Drove multi-module Oracle Cloud HCM migration (17 modules, 11-month programme): delivered USD 700K annual savings and 30% IT cost reduction — flagship digital transformation achievement with measurable business impact</w:t>
+        <w:t xml:space="preserve">Service Excellence &amp; Process Improvement:</w:t>
       </w:r>
     </w:p>
     <w:p>

</xml_diff>

<commit_message>
Remove Oracle Cloud migration claim, fully detail the Avaya-to-Genesys migration (#27)
- Drop all "Oracle Cloud HCM migration" content (Programmer Analyst tile,
  resume Core Competencies, role subtitle, and the $700K/17-modules/30%
  cost-reduction bullet) from the portfolio, the downloadable PDF resume,
  and the DOCX resume.
- Properly detail the Avaya-to-Genesys Cloud CX migration on the resume
  (it was already complete on the portfolio): name Avaya explicitly, and
  add the 8-lines-of-business and 2% average-handling-time figures that
  were on the portfolio but missing from the resume.
- Resume PDF was rebuilt directly from its own extracted layout (same
  fonts/margins/colors) so it stays a clean 2-page document; resume DOCX
  edited and validated directly.


Claude-Session: https://claude.ai/code/session_01DzH1d4xTk3fh1jGc7zmtxu

Co-authored-by: Claude Sonnet 5 <noreply@anthropic.com>
</commit_message>
<xml_diff>
--- a/Madhumitha_Challa_Intern_Graduate.docx
+++ b/Madhumitha_Challa_Intern_Graduate.docx
@@ -47,7 +47,7 @@
         <w:spacing w:after="400"/>
       </w:pPr>
       <w:r>
-        <w:t xml:space="preserve">Enterprise IT professional with 3+ years of hands-on experience at Cognizant Technology Solutions delivering quantifiable digital transformation across mission-critical healthcare operations (3.2M members). Currently finalizing Master of Information Technology at Monash University (graduating Dec 2026, WAM 65.7). Proven track record: USD 700K annual cost savings, 30% IT cost reduction, 5% patient engagement improvement, 95%+ audit compliance maintained. Expertise in real-time systems monitoring, cloud platform modernization, root cause analysis, and infrastructure optimization. AWS CCP certified. Demonstrated leadership mentoring 20+ postgraduate IT students.</w:t>
+        <w:t xml:space="preserve">Enterprise IT professional with 3+ years of hands-on experience at Cognizant Technology Solutions delivering quantifiable digital transformation across mission-critical healthcare operations (3.2M members). Currently finalizing Master of Information Technology at Monash University (graduating Dec 2026, WAM 65.7). Proven track record: Avaya-to-Genesys Cloud CX migration across 30,000+ associates and agents, 5% patient engagement improvement, 20% reduction in manual interventions, 95%+ audit compliance maintained. Expertise in real-time systems monitoring, cloud platform modernization, root cause analysis, and infrastructure optimization. AWS CCP certified. Demonstrated leadership mentoring 20+ postgraduate IT students.</w:t>
       </w:r>
     </w:p>
     <w:p>
@@ -67,7 +67,7 @@
         <w:spacing w:after="100"/>
       </w:pPr>
       <w:r>
-        <w:t xml:space="preserve">Cloud Platforms &amp; Modernization: Oracle Cloud HCM | Genesys Cloud CX | Google Cloud | AWS | Azure MFA | Microsoft 365</w:t>
+        <w:t xml:space="preserve">Cloud Platforms &amp; Modernization: Genesys Cloud CX | Google Cloud | AWS | Azure MFA | Microsoft 365</w:t>
       </w:r>
     </w:p>
     <w:p>
@@ -291,7 +291,7 @@
         <w:spacing w:after="50"/>
       </w:pPr>
       <w:r>
-        <w:t xml:space="preserve">• Contributed to Genesys Cloud CX migration (30,000+ associates): delivered 5% patient engagement improvement and 20% reduction in manual interventions — quantifiable proof of impact in cloud-driven digital transformation</w:t>
+        <w:t xml:space="preserve">• Contributed to Cognizant’s Avaya-to-Genesys Cloud CX contact center migration (30,000+ associates and agents across 8 lines of business): delivered a 5% increase in patient engagement, 20% reduction in manual interventions per week, and 2% decrease in average handling time — quantifiable proof of impact in cloud-driven digital transformation</w:t>
       </w:r>
     </w:p>
     <w:p>
@@ -315,15 +315,7 @@
         <w:spacing w:after="50"/>
       </w:pPr>
       <w:r>
-        <w:t xml:space="preserve">Cloud Modernization &amp; Enterprise Systems Integration (Oracle Cloud HCM):</w:t>
-      </w:r>
-    </w:p>
-    <w:p>
-      <w:pPr>
-        <w:spacing w:after="50"/>
-      </w:pPr>
-      <w:r>
-        <w:t xml:space="preserve">• Drove multi-module Oracle Cloud HCM migration (17 modules, 11-month programme): delivered USD 700K annual savings and 30% IT cost reduction — flagship digital transformation achievement with measurable business impact</w:t>
+        <w:t xml:space="preserve">Service Excellence &amp; Process Improvement:</w:t>
       </w:r>
     </w:p>
     <w:p>

</xml_diff>

<commit_message>
Update IT Postgraduate Peer Mentor count: 20+ -> 40+
Wrong everywhere it appeared: the Experience card (summary and
detail), the Tuesday juggle card, the chat assistant's FAQ answer, and
both resume files.

Co-Authored-By: Claude Sonnet 5 <noreply@anthropic.com>
Claude-Session: https://claude.ai/code/session_01DzH1d4xTk3fh1jGc7zmtxu
</commit_message>
<xml_diff>
--- a/Madhumitha_Challa_Intern_Graduate.docx
+++ b/Madhumitha_Challa_Intern_Graduate.docx
@@ -47,7 +47,7 @@
         <w:spacing w:after="400"/>
       </w:pPr>
       <w:r>
-        <w:t xml:space="preserve">Enterprise IT professional with 3+ years of hands-on experience at Cognizant Technology Solutions delivering quantifiable digital transformation across mission-critical healthcare operations (3.2M members). Currently finalizing Master of Information Technology at Monash University (graduating Dec 2026, WAM 65.7). Proven track record: Avaya-to-Genesys Cloud CX migration across 30,000+ associates and agents, 5% patient engagement improvement, 20% reduction in manual interventions, 95%+ audit compliance maintained. Expertise in real-time systems monitoring, cloud platform modernization, root cause analysis, and infrastructure optimization. AWS CCP certified. Demonstrated leadership mentoring 20+ postgraduate IT students.</w:t>
+        <w:t>Enterprise IT professional with 3+ years of hands-on experience at Cognizant Technology Solutions delivering quantifiable digital transformation across mission-critical healthcare operations (3.2M members). Currently finalizing Master of Information Technology at Monash University (graduating Dec 2026, WAM 65.7). Proven track record: Avaya-to-Genesys Cloud CX migration across 30,000+ associates and agents, 5% patient engagement improvement, 20% reduction in manual interventions, 95%+ audit compliance maintained. Expertise in real-time systems monitoring, cloud platform modernization, root cause analysis, and infrastructure optimization. AWS CCP certified. Demonstrated leadership mentoring 40+ postgraduate IT students.</w:t>
       </w:r>
     </w:p>
     <w:p>
@@ -399,7 +399,7 @@
         <w:spacing w:after="200"/>
       </w:pPr>
       <w:r>
-        <w:t xml:space="preserve">• Mentor 20+ postgraduate IT students; manage infrastructure for Monash Data &amp; AI Society (1,600+ members); support community growth and peer learning</w:t>
+        <w:t>• Mentor 40+ postgraduate IT students; manage infrastructure for Monash Data &amp; AI Society (1,600+ members); support community growth and peer learning</w:t>
       </w:r>
     </w:p>
     <w:p>

</xml_diff>

<commit_message>
Update IT Postgraduate Peer Mentor count: 20+ -> 40+ (#48)
Wrong everywhere it appeared: the Experience card (summary and
detail), the Tuesday juggle card, the chat assistant's FAQ answer, and
both resume files.
</commit_message>
<xml_diff>
--- a/Madhumitha_Challa_Intern_Graduate.docx
+++ b/Madhumitha_Challa_Intern_Graduate.docx
@@ -47,7 +47,7 @@
         <w:spacing w:after="400"/>
       </w:pPr>
       <w:r>
-        <w:t xml:space="preserve">Enterprise IT professional with 3+ years of hands-on experience at Cognizant Technology Solutions delivering quantifiable digital transformation across mission-critical healthcare operations (3.2M members). Currently finalizing Master of Information Technology at Monash University (graduating Dec 2026, WAM 65.7). Proven track record: Avaya-to-Genesys Cloud CX migration across 30,000+ associates and agents, 5% patient engagement improvement, 20% reduction in manual interventions, 95%+ audit compliance maintained. Expertise in real-time systems monitoring, cloud platform modernization, root cause analysis, and infrastructure optimization. AWS CCP certified. Demonstrated leadership mentoring 20+ postgraduate IT students.</w:t>
+        <w:t>Enterprise IT professional with 3+ years of hands-on experience at Cognizant Technology Solutions delivering quantifiable digital transformation across mission-critical healthcare operations (3.2M members). Currently finalizing Master of Information Technology at Monash University (graduating Dec 2026, WAM 65.7). Proven track record: Avaya-to-Genesys Cloud CX migration across 30,000+ associates and agents, 5% patient engagement improvement, 20% reduction in manual interventions, 95%+ audit compliance maintained. Expertise in real-time systems monitoring, cloud platform modernization, root cause analysis, and infrastructure optimization. AWS CCP certified. Demonstrated leadership mentoring 40+ postgraduate IT students.</w:t>
       </w:r>
     </w:p>
     <w:p>
@@ -399,7 +399,7 @@
         <w:spacing w:after="200"/>
       </w:pPr>
       <w:r>
-        <w:t xml:space="preserve">• Mentor 20+ postgraduate IT students; manage infrastructure for Monash Data &amp; AI Society (1,600+ members); support community growth and peer learning</w:t>
+        <w:t>• Mentor 40+ postgraduate IT students; manage infrastructure for Monash Data &amp; AI Society (1,600+ members); support community growth and peer learning</w:t>
       </w:r>
     </w:p>
     <w:p>

</xml_diff>

<commit_message>
Add CloudPose project card + live demo, update resume skills
- New project card: CloudPose (FastAPI/OpenCV pose-estimation service on a
  self-built OCI Kubernetes cluster), linking to the projects repo writeup
  and a new in-browser live demo (real TensorFlow.js pose detection, plus
  a clearly-labelled simulated architecture/load-test section) - no real
  coursework code or infra exposed.
- Resume (PDF + DOCX): added Python, FastAPI, OpenCV, PowerShell, Docker,
  Kubernetes and Oracle Cloud Infrastructure (OCI) to Core Competencies,
  matching what's already on the Skills section. Tightened spacing/margins
  slightly to keep it at 2 pages after the additions.
</commit_message>
<xml_diff>
--- a/Madhumitha_Challa_Intern_Graduate.docx
+++ b/Madhumitha_Challa_Intern_Graduate.docx
@@ -14,7 +14,7 @@
     </w:p>
     <w:p>
       <w:pPr>
-        <w:spacing w:after="200"/>
+        <w:spacing w:after="120"/>
         <w:jc w:val="center"/>
       </w:pPr>
       <w:r>
@@ -23,7 +23,7 @@
     </w:p>
     <w:p>
       <w:pPr>
-        <w:spacing w:after="400"/>
+        <w:spacing w:after="240"/>
         <w:jc w:val="center"/>
       </w:pPr>
       <w:r>
@@ -36,7 +36,7 @@
         <w:pBdr>
           <w:bottom w:val="single" w:color="2E5090" w:sz="6" w:space="1"/>
         </w:pBdr>
-        <w:spacing w:after="200" w:before="200"/>
+        <w:spacing w:after="120" w:before="120"/>
       </w:pPr>
       <w:r>
         <w:t xml:space="preserve">PROFESSIONAL PROFILE</w:t>
@@ -44,7 +44,7 @@
     </w:p>
     <w:p>
       <w:pPr>
-        <w:spacing w:after="400"/>
+        <w:spacing w:after="240"/>
       </w:pPr>
       <w:r>
         <w:t>Enterprise IT professional with 3+ years of hands-on experience at Cognizant Technology Solutions delivering quantifiable digital transformation across mission-critical healthcare operations (3.2M members). Currently finalizing Master of Information Technology at Monash University (graduating Dec 2026, WAM 65.7). Proven track record: Avaya-to-Genesys Cloud CX migration across 30,000+ associates and agents, 5% patient engagement improvement, 20% reduction in manual interventions, 95%+ audit compliance maintained. Expertise in real-time systems monitoring, cloud platform modernization, root cause analysis, and infrastructure optimization. AWS CCP certified. Demonstrated leadership mentoring 40+ postgraduate IT students.</w:t>
@@ -56,7 +56,7 @@
         <w:pBdr>
           <w:bottom w:val="single" w:color="2E5090" w:sz="6" w:space="1"/>
         </w:pBdr>
-        <w:spacing w:after="200" w:before="200"/>
+        <w:spacing w:after="120" w:before="120"/>
       </w:pPr>
       <w:r>
         <w:t xml:space="preserve">CORE COMPETENCIES</w:t>
@@ -64,15 +64,15 @@
     </w:p>
     <w:p>
       <w:pPr>
-        <w:spacing w:after="100"/>
-      </w:pPr>
-      <w:r>
-        <w:t xml:space="preserve">Cloud Platforms &amp; Modernization: Genesys Cloud CX | Google Cloud | AWS | Azure MFA | Microsoft 365</w:t>
-      </w:r>
-    </w:p>
-    <w:p>
-      <w:pPr>
-        <w:spacing w:after="100"/>
+        <w:spacing w:after="60"/>
+      </w:pPr>
+      <w:r>
+        <w:t>Cloud Platforms &amp; Modernization: Genesys Cloud CX | Google Cloud | AWS | Azure MFA | Microsoft 365 | Oracle Cloud Infrastructure (OCI)</w:t>
+      </w:r>
+    </w:p>
+    <w:p>
+      <w:pPr>
+        <w:spacing w:after="60"/>
       </w:pPr>
       <w:r>
         <w:t xml:space="preserve">Real-Time Systems &amp; Analytics: Netcool Monitoring | Alert Management &amp; Analytics | Root Cause Analysis | Performance Metrics &amp; Dashboarding | DB2 | SQL</w:t>
@@ -80,18 +80,18 @@
     </w:p>
     <w:p>
       <w:pPr>
-        <w:spacing w:after="100"/>
-      </w:pPr>
-      <w:r>
-        <w:t xml:space="preserve">IT Operations &amp; Infrastructure: Active Directory | SCCM | Windows/Linux Servers | Citrix Servers | IAM &amp; Identity Management (CyberArk, SailPoint) | Change Management | SLA Management</w:t>
-      </w:r>
-    </w:p>
-    <w:p>
-      <w:pPr>
-        <w:spacing w:after="400"/>
-      </w:pPr>
-      <w:r>
-        <w:t xml:space="preserve">Programming &amp; Development: Java | C/C++ | COBOL | JCL | Kotlin | Firebase | API Integration | SQL</w:t>
+        <w:spacing w:after="60"/>
+      </w:pPr>
+      <w:r>
+        <w:t>IT Operations &amp; Infrastructure: Active Directory | SCCM | Windows/Linux Servers | Citrix Servers | IAM &amp; Identity Management (CyberArk, SailPoint) | Change Management | SLA Management | PowerShell | Docker | Kubernetes</w:t>
+      </w:r>
+    </w:p>
+    <w:p>
+      <w:pPr>
+        <w:spacing w:after="240"/>
+      </w:pPr>
+      <w:r>
+        <w:t>Programming &amp; Development: Java | C/C++ | COBOL | JCL | Kotlin | Firebase | API Integration | SQL | Python | FastAPI | OpenCV</w:t>
       </w:r>
     </w:p>
     <w:p>
@@ -100,7 +100,7 @@
         <w:pBdr>
           <w:bottom w:val="single" w:color="2E5090" w:sz="6" w:space="1"/>
         </w:pBdr>
-        <w:spacing w:after="200" w:before="200"/>
+        <w:spacing w:after="120" w:before="120"/>
       </w:pPr>
       <w:r>
         <w:t xml:space="preserve">RECENT EXPERIENCE &amp; PROJECTS</w:t>
@@ -108,7 +108,7 @@
     </w:p>
     <w:p>
       <w:pPr>
-        <w:spacing w:after="100" w:before="100"/>
+        <w:spacing w:after="60" w:before="60"/>
       </w:pPr>
       <w:r>
         <w:t>HR Administrative Officer | Monash University</w:t>
@@ -116,7 +116,7 @@
     </w:p>
     <w:p>
       <w:pPr>
-        <w:spacing w:after="100"/>
+        <w:spacing w:after="60"/>
       </w:pPr>
       <w:r>
         <w:t>August 2026–October 2026</w:t>
@@ -124,7 +124,7 @@
     </w:p>
     <w:p>
       <w:pPr>
-        <w:spacing w:after="50"/>
+        <w:spacing w:after="30"/>
       </w:pPr>
       <w:r>
         <w:t>• Casual HR Administrative Officer role (HEW 4, ~10 hrs/week) within the HR Projects team, Office of the Chief Operating Officer &amp; Senior Vice-President, Clayton Campus</w:t>
@@ -132,7 +132,7 @@
     </w:p>
     <w:p>
       <w:pPr>
-        <w:spacing w:after="100" w:before="100"/>
+        <w:spacing w:after="60" w:before="60"/>
       </w:pPr>
       <w:r>
         <w:t xml:space="preserve">Technology &amp; Digital Innovation Intern | Baazar (Fund'ex venture)</w:t>
@@ -140,7 +140,7 @@
     </w:p>
     <w:p>
       <w:pPr>
-        <w:spacing w:after="100"/>
+        <w:spacing w:after="60"/>
       </w:pPr>
       <w:r>
         <w:t>September 2026–Present</w:t>
@@ -148,7 +148,7 @@
     </w:p>
     <w:p>
       <w:pPr>
-        <w:spacing w:after="50"/>
+        <w:spacing w:after="30"/>
       </w:pPr>
       <w:r>
         <w:t xml:space="preserve">• Supporting digital platform research, planning, and technical documentation for an upcoming venture; contributing to website/software testing, user testing, and bug reporting under supervision</w:t>
@@ -156,7 +156,7 @@
     </w:p>
     <w:p>
       <w:pPr>
-        <w:spacing w:after="50"/>
+        <w:spacing w:after="30"/>
       </w:pPr>
       <w:r>
         <w:t xml:space="preserve">• Supporting data organisation, reporting, and dashboard/analytics tasks alongside CRM and business process documentation; researching software tools, APIs, and digital platform solutions</w:t>
@@ -164,7 +164,7 @@
     </w:p>
     <w:p>
       <w:pPr>
-        <w:spacing w:after="200"/>
+        <w:spacing w:after="120"/>
       </w:pPr>
       <w:r>
         <w:t xml:space="preserve">• Preparing user guides, workflow notes, and process maps; applying cybersecurity awareness practices, including documentation and basic risk checks, as part of structured team learning tasks</w:t>
@@ -172,7 +172,7 @@
     </w:p>
     <w:p>
       <w:pPr>
-        <w:spacing w:after="100" w:before="100"/>
+        <w:spacing w:after="60" w:before="60"/>
       </w:pPr>
       <w:r>
         <w:t xml:space="preserve">TeaMWork Virtual Intern &amp; Team Co-Lead | Monash-Warwick Alliance</w:t>
@@ -180,7 +180,7 @@
     </w:p>
     <w:p>
       <w:pPr>
-        <w:spacing w:after="100"/>
+        <w:spacing w:after="60"/>
       </w:pPr>
       <w:r>
         <w:t xml:space="preserve">July 2026</w:t>
@@ -188,7 +188,7 @@
     </w:p>
     <w:p>
       <w:pPr>
-        <w:spacing w:after="50"/>
+        <w:spacing w:after="30"/>
       </w:pPr>
       <w:r>
         <w:t xml:space="preserve">• Led AI-driven market expansion strategy; developed segment prioritisation matrix across 3 FM portfolios using analytics</w:t>
@@ -196,7 +196,7 @@
     </w:p>
     <w:p>
       <w:pPr>
-        <w:spacing w:after="50"/>
+        <w:spacing w:after="30"/>
       </w:pPr>
       <w:r>
         <w:t xml:space="preserve">• Quantified financial impact: SGD 4.35M annual savings (Facilities Management), SGD 261K/yr (Commercial), SGD 696K/yr (Universities); identified SGD 2M+ revenue pipeline from 15 target companies</w:t>
@@ -204,7 +204,7 @@
     </w:p>
     <w:p>
       <w:pPr>
-        <w:spacing w:after="200"/>
+        <w:spacing w:after="120"/>
       </w:pPr>
       <w:r>
         <w:t xml:space="preserve">• Applied data analytics and ROI modelling to validate market assumptions and support strategic pilot framework</w:t>
@@ -212,7 +212,7 @@
     </w:p>
     <w:p>
       <w:pPr>
-        <w:spacing w:after="100" w:before="100"/>
+        <w:spacing w:after="60" w:before="60"/>
       </w:pPr>
       <w:r>
         <w:t xml:space="preserve">T&amp;A FLEX Data Entry Assistant (HEW 4) | Monash University</w:t>
@@ -220,7 +220,7 @@
     </w:p>
     <w:p>
       <w:pPr>
-        <w:spacing w:after="100"/>
+        <w:spacing w:after="60"/>
       </w:pPr>
       <w:r>
         <w:t xml:space="preserve">July–August 2026</w:t>
@@ -228,7 +228,7 @@
     </w:p>
     <w:p>
       <w:pPr>
-        <w:spacing w:after="50"/>
+        <w:spacing w:after="30"/>
       </w:pPr>
       <w:r>
         <w:t xml:space="preserve">• Supported enterprise system rollout (Nimbus time &amp; attendance) across Peninsula Campus serving 500+ staff; achieved clean data migration</w:t>
@@ -236,7 +236,7 @@
     </w:p>
     <w:p>
       <w:pPr>
-        <w:spacing w:after="200"/>
+        <w:spacing w:after="120"/>
       </w:pPr>
       <w:r>
         <w:t xml:space="preserve">• Identified and escalated critical go-live dependency issues before system launch, preventing operational disruption</w:t>
@@ -248,7 +248,7 @@
         <w:pBdr>
           <w:bottom w:val="single" w:color="2E5090" w:sz="6" w:space="1"/>
         </w:pBdr>
-        <w:spacing w:after="200" w:before="200"/>
+        <w:spacing w:after="120" w:before="120"/>
       </w:pPr>
       <w:r>
         <w:t xml:space="preserve">COGNIZANT TECHNOLOGY SOLUTIONS</w:t>
@@ -256,7 +256,7 @@
     </w:p>
     <w:p>
       <w:pPr>
-        <w:spacing w:after="100" w:before="100"/>
+        <w:spacing w:after="60" w:before="60"/>
       </w:pPr>
       <w:r>
         <w:t xml:space="preserve">Programmer | EmblemHealth &amp; ConnectiCare (3.2M members) | Nov 2023–Jul 2024</w:t>
@@ -264,7 +264,7 @@
     </w:p>
     <w:p>
       <w:pPr>
-        <w:spacing w:after="50"/>
+        <w:spacing w:after="30"/>
       </w:pPr>
       <w:r>
         <w:t xml:space="preserve">Real-time Systems Monitoring &amp; Cloud Migration Delivery:</w:t>
@@ -272,7 +272,7 @@
     </w:p>
     <w:p>
       <w:pPr>
-        <w:spacing w:after="50"/>
+        <w:spacing w:after="30"/>
       </w:pPr>
       <w:r>
         <w:t xml:space="preserve">• Managed 50–80+ real-time Netcool alerts per shift; maintained 95%+ Audit Dashboard Score — demonstrating expertise in high-volume alert analytics and incident prioritisation at enterprise scale</w:t>
@@ -280,7 +280,7 @@
     </w:p>
     <w:p>
       <w:pPr>
-        <w:spacing w:after="50"/>
+        <w:spacing w:after="30"/>
       </w:pPr>
       <w:r>
         <w:t xml:space="preserve">• Conducted proactive problem record analysis and root cause analysis to identify recurring system failures; implemented preventative measures that reduced repeat incidents, improving overall system reliability</w:t>
@@ -288,7 +288,7 @@
     </w:p>
     <w:p>
       <w:pPr>
-        <w:spacing w:after="50"/>
+        <w:spacing w:after="30"/>
       </w:pPr>
       <w:r>
         <w:t xml:space="preserve">• Contributed to Cognizant’s Avaya-to-Genesys Cloud CX contact center migration (30,000+ associates and agents across 8 lines of business): delivered a 5% increase in patient engagement, 20% reduction in manual interventions per week, and 2% decrease in average handling time — quantifiable proof of impact in cloud-driven digital transformation</w:t>
@@ -296,7 +296,7 @@
     </w:p>
     <w:p>
       <w:pPr>
-        <w:spacing w:after="200"/>
+        <w:spacing w:after="120"/>
       </w:pPr>
       <w:r>
         <w:t xml:space="preserve">• Administered and optimised critical infrastructure: Active Directory, Azure MFA, M365, CyberArk, SailPoint, Windows/Linux servers, and Citrix servers; designed Event Alert Dashboard for real-time performance visibility across enterprise systems</w:t>
@@ -304,7 +304,7 @@
     </w:p>
     <w:p>
       <w:pPr>
-        <w:spacing w:after="100" w:before="100"/>
+        <w:spacing w:after="60" w:before="60"/>
       </w:pPr>
       <w:r>
         <w:t xml:space="preserve">Programmer Analyst | EmblemHealth &amp; ConnectiCare | Apr 2022–Nov 2023</w:t>
@@ -312,7 +312,7 @@
     </w:p>
     <w:p>
       <w:pPr>
-        <w:spacing w:after="50"/>
+        <w:spacing w:after="30"/>
       </w:pPr>
       <w:r>
         <w:t xml:space="preserve">Service Excellence &amp; Process Improvement:</w:t>
@@ -320,7 +320,7 @@
     </w:p>
     <w:p>
       <w:pPr>
-        <w:spacing w:after="50"/>
+        <w:spacing w:after="30"/>
       </w:pPr>
       <w:r>
         <w:t xml:space="preserve">• Resolved 100+ incidents/month within SLA with 100% CSAT score and 95%+ Audit Dashboard Score; earned CSAT Champion award (Sep 2023) for sustained excellence in incident management</w:t>
@@ -328,7 +328,7 @@
     </w:p>
     <w:p>
       <w:pPr>
-        <w:spacing w:after="50"/>
+        <w:spacing w:after="30"/>
       </w:pPr>
       <w:r>
         <w:t xml:space="preserve">• Authored 15+ comprehensive technical SOPs; reduced team onboarding time by 50%+, significantly improving knowledge transfer and operational efficiency</w:t>
@@ -336,7 +336,7 @@
     </w:p>
     <w:p>
       <w:pPr>
-        <w:spacing w:after="200"/>
+        <w:spacing w:after="120"/>
       </w:pPr>
       <w:r>
         <w:t xml:space="preserve">• Recognised with Cognizant Cheers Awards (Sapphire &amp; Amber, 2023) for excellence in delivery, technical depth, and cross-functional collaboration</w:t>
@@ -344,7 +344,7 @@
     </w:p>
     <w:p>
       <w:pPr>
-        <w:spacing w:after="100" w:before="100"/>
+        <w:spacing w:after="60" w:before="60"/>
       </w:pPr>
       <w:r>
         <w:t xml:space="preserve">Programmer Analyst Trainee | EmblemHealth &amp; ConnectiCare | May 2021–Mar 2022</w:t>
@@ -352,7 +352,7 @@
     </w:p>
     <w:p>
       <w:pPr>
-        <w:spacing w:after="200"/>
+        <w:spacing w:after="120"/>
       </w:pPr>
       <w:r>
         <w:t xml:space="preserve">• Completed structured onboarding in enterprise systems stack: COBOL, JCL, DB2, incident management; achieved progressive SLA independence and demonstrated rapid skill acquisition in mission-critical systems</w:t>
@@ -364,7 +364,7 @@
         <w:pBdr>
           <w:bottom w:val="single" w:color="2E5090" w:sz="6" w:space="1"/>
         </w:pBdr>
-        <w:spacing w:after="200" w:before="200"/>
+        <w:spacing w:after="120" w:before="120"/>
       </w:pPr>
       <w:r>
         <w:t xml:space="preserve">VOLUNTEER &amp; MENTORING ROLES</w:t>
@@ -372,7 +372,7 @@
     </w:p>
     <w:p>
       <w:pPr>
-        <w:spacing w:after="50" w:before="100"/>
+        <w:spacing w:after="30" w:before="60"/>
       </w:pPr>
       <w:r>
         <w:t xml:space="preserve">Microsoft 365 Administrator (Volunteer) | Basava Samiti APAC | Oct 2025–Present</w:t>
@@ -380,7 +380,7 @@
     </w:p>
     <w:p>
       <w:pPr>
-        <w:spacing w:after="200"/>
+        <w:spacing w:after="120"/>
       </w:pPr>
       <w:r>
         <w:t xml:space="preserve">• Manage M365 infrastructure across 8 APAC chapters serving 100+ users; authored 3 SOPs reducing ticket volume by 30–40% through improved self-service documentation</w:t>
@@ -388,7 +388,7 @@
     </w:p>
     <w:p>
       <w:pPr>
-        <w:spacing w:after="50" w:before="100"/>
+        <w:spacing w:after="30" w:before="60"/>
       </w:pPr>
       <w:r>
         <w:t xml:space="preserve">IT Postgraduate Peer Mentor | Monash University | Jan 2026–Present</w:t>
@@ -396,7 +396,7 @@
     </w:p>
     <w:p>
       <w:pPr>
-        <w:spacing w:after="200"/>
+        <w:spacing w:after="120"/>
       </w:pPr>
       <w:r>
         <w:t>• Mentor 40+ postgraduate IT students; manage infrastructure for Monash Data &amp; AI Society (1,600+ members); support community growth and peer learning</w:t>
@@ -404,7 +404,7 @@
     </w:p>
     <w:p>
       <w:pPr>
-        <w:spacing w:after="100" w:before="100"/>
+        <w:spacing w:after="60" w:before="60"/>
       </w:pPr>
       <w:r>
         <w:t>Student Adviser | Monash Student Communities | Jul 2025–Present</w:t>
@@ -412,7 +412,7 @@
     </w:p>
     <w:p>
       <w:pPr>
-        <w:spacing w:after="400"/>
+        <w:spacing w:after="240"/>
       </w:pPr>
       <w:r>
         <w:t xml:space="preserve">• Mentor a cohort of undergrad and postgrad students through one-on-one check-ins and cluster catch-ups, helping new students navigate university life, and encouraging several of my own mentees to step up into advising themselves</w:t>
@@ -424,7 +424,7 @@
         <w:pBdr>
           <w:bottom w:val="single" w:color="2E5090" w:sz="6" w:space="1"/>
         </w:pBdr>
-        <w:spacing w:after="200" w:before="200"/>
+        <w:spacing w:after="120" w:before="120"/>
       </w:pPr>
       <w:r>
         <w:t xml:space="preserve">EDUCATION &amp; CERTIFICATIONS</w:t>
@@ -432,7 +432,7 @@
     </w:p>
     <w:p>
       <w:pPr>
-        <w:spacing w:after="100"/>
+        <w:spacing w:after="60"/>
       </w:pPr>
       <w:r>
         <w:t xml:space="preserve">Master of Information Technology | Monash University | Graduating Dec 2026 | WAM 65.7</w:t>
@@ -440,7 +440,7 @@
     </w:p>
     <w:p>
       <w:pPr>
-        <w:spacing w:after="100"/>
+        <w:spacing w:after="60"/>
       </w:pPr>
       <w:r>
         <w:t xml:space="preserve">Bachelor of Computer Applications | University of Madras | 2020 | First Class</w:t>
@@ -448,7 +448,7 @@
     </w:p>
     <w:p>
       <w:pPr>
-        <w:spacing w:after="100"/>
+        <w:spacing w:after="60"/>
       </w:pPr>
       <w:r>
         <w:t xml:space="preserve">AWS Certified Cloud Practitioner | July 2024</w:t>
@@ -456,7 +456,7 @@
     </w:p>
     <w:p>
       <w:pPr>
-        <w:spacing w:after="200"/>
+        <w:spacing w:after="120"/>
       </w:pPr>
       <w:r>
         <w:t xml:space="preserve">IELTS Academic | Band 7 (Speaking 8.5, Reading 7.0, Listening 6.5, Writing 6.0)</w:t>
@@ -468,7 +468,7 @@
         <w:pBdr>
           <w:bottom w:val="single" w:color="2E5090" w:sz="6" w:space="1"/>
         </w:pBdr>
-        <w:spacing w:after="200" w:before="200"/>
+        <w:spacing w:after="120" w:before="120"/>
       </w:pPr>
       <w:r>
         <w:t xml:space="preserve">LANGUAGES</w:t>
@@ -476,7 +476,7 @@
     </w:p>
     <w:p>
       <w:pPr>
-        <w:spacing w:after="400"/>
+        <w:spacing w:after="240"/>
       </w:pPr>
       <w:r>
         <w:t>English (Proficient) | Telugu (Native) | Tamil (Fluent) | Hindi (Conversational)</w:t>
@@ -484,7 +484,7 @@
     </w:p>
     <w:p>
       <w:pPr>
-        <w:spacing w:before="200"/>
+        <w:spacing w:before="120"/>
         <w:jc w:val="center"/>
       </w:pPr>
       <w:r>
@@ -493,7 +493,7 @@
     </w:p>
     <w:sectPr>
       <w:pgSz w:w="11906" w:h="16838" w:orient="portrait"/>
-      <w:pgMar w:top="1440" w:right="1440" w:bottom="1440" w:left="1440" w:header="708" w:footer="708" w:gutter="0"/>
+      <w:pgMar w:top="648" w:right="1440" w:bottom="648" w:left="1440" w:header="708" w:footer="708" w:gutter="0"/>
       <w:pgNumType/>
       <w:docGrid w:linePitch="360"/>
     </w:sectPr>

</xml_diff>

<commit_message>
Add references to the resume and a deep-sky site backdrop
- Resume (DOCX and PDF): References section with Adam Fernandes, Senior
  Coordinator, Monash Student Communities. Closes with "Further referees
  available on request." Still two pages.
- Timeline: the rail is darker in light mode so it reads clearly.
- Backdrop: a Milky-Way-style haze and soft nebula clouds in the site's accent
  colours, drawn once per resize, with stars in cool, blue-white and warm tints
  and a few brighter stars. Constellation lines are kept.
</commit_message>
<xml_diff>
--- a/Madhumitha_Challa_Intern_Graduate.docx
+++ b/Madhumitha_Challa_Intern_Graduate.docx
@@ -484,11 +484,31 @@
     </w:p>
     <w:p>
       <w:pPr>
+        <w:pStyle w:val="Heading2"/>
+        <w:pBdr>
+          <w:bottom w:val="single" w:color="2E5090" w:sz="6" w:space="1"/>
+        </w:pBdr>
+        <w:spacing w:after="120" w:before="120"/>
+      </w:pPr>
+      <w:r>
+        <w:t>REFERENCES</w:t>
+      </w:r>
+    </w:p>
+    <w:p>
+      <w:pPr>
+        <w:spacing w:after="240"/>
+      </w:pPr>
+      <w:r>
+        <w:t>Adam Fernandes | Senior Coordinator, Monash Student Communities | Contact details available on request</w:t>
+      </w:r>
+    </w:p>
+    <w:p>
+      <w:pPr>
         <w:spacing w:before="120"/>
         <w:jc w:val="center"/>
       </w:pPr>
       <w:r>
-        <w:t xml:space="preserve">References available on request</w:t>
+        <w:t>Further referees available on request.</w:t>
       </w:r>
     </w:p>
     <w:sectPr>

</xml_diff>